<commit_message>
Dijital icerikler Ekim 2026 e-icerik tablosuna gore gozden gecirildi: tablo turleri duzeltildi, 1.9 surukle-birak kutulari netlestirildi, unite sonu dijital sorularina yapilandirilmis grid sorusu eklendi
</commit_message>
<xml_diff>
--- a/dijital/Kim12_tema-1-dijital-unite-sonu-sorulari.docx
+++ b/dijital/Kim12_tema-1-dijital-unite-sonu-sorulari.docx
@@ -3543,6 +3543,543 @@
           <w:lang w:val="tr-TR"/>
         </w:rPr>
         <w:t xml:space="preserve">Cevap: 2: 1,20 g (akım iki katı); 3: 60 dk (kütle iki katı, akım aynı); 4: 2,0 A (süre yarıya inmiş, kütle aynı)</w:t>
+      </w:r>
+    </w:p>
+    <w:p>
+      <w:pPr>
+        <w:jc w:val="both"/>
+        <w:rPr>
+          <w:rFonts w:ascii="Times New Roman" w:hAnsi="Times New Roman" w:cs="Times New Roman"/>
+          <w:lang w:val="tr-TR"/>
+        </w:rPr>
+      </w:pPr>
+      <w:r>
+        <w:rPr>
+          <w:rFonts w:ascii="Times New Roman" w:hAnsi="Times New Roman" w:cs="Times New Roman"/>
+          <w:lang w:val="tr-TR"/>
+        </w:rPr>
+        <w:t xml:space="preserve">15. Aşağıdaki yapılandırılmış gridde elektrokimyayla ilgili bazı süreçler verilmiştir. Gridi kullanarak soruları yanıtlayınız.</w:t>
+      </w:r>
+    </w:p>
+    <w:tbl>
+      <w:tblPr>
+        <w:tblW w:w="9000" w:type="dxa"/>
+        <w:jc w:val="center"/>
+        <w:tblBorders>
+          <w:top w:val="single" w:sz="4" w:space="0" w:color="auto"/>
+          <w:left w:val="single" w:sz="4" w:space="0" w:color="auto"/>
+          <w:bottom w:val="single" w:sz="4" w:space="0" w:color="auto"/>
+          <w:right w:val="single" w:sz="4" w:space="0" w:color="auto"/>
+          <w:insideH w:val="single" w:sz="4" w:space="0" w:color="auto"/>
+          <w:insideV w:val="single" w:sz="4" w:space="0" w:color="auto"/>
+        </w:tblBorders>
+        <w:tblLayout w:type="fixed"/>
+        <w:tblLook w:val="04A0"/>
+      </w:tblPr>
+      <w:tblGrid>
+        <w:gridCol w:w="3000"/>
+        <w:gridCol w:w="3000"/>
+        <w:gridCol w:w="3000"/>
+      </w:tblGrid>
+      <w:tr>
+        <w:tc>
+          <w:tcPr>
+            <w:tcW w:w="3000" w:type="dxa"/>
+            <w:vAlign w:val="center"/>
+          </w:tcPr>
+          <w:p>
+            <w:pPr>
+              <w:jc w:val="center"/>
+              <w:rPr>
+                <w:rFonts w:ascii="Times New Roman" w:hAnsi="Times New Roman" w:cs="Times New Roman"/>
+                <w:lang w:val="tr-TR"/>
+              </w:rPr>
+            </w:pPr>
+            <w:r>
+              <w:rPr>
+                <w:rFonts w:ascii="Times New Roman" w:hAnsi="Times New Roman" w:cs="Times New Roman"/>
+                <w:lang w:val="tr-TR"/>
+              </w:rPr>
+              <w:t xml:space="preserve">1</w:t>
+            </w:r>
+          </w:p>
+          <w:p>
+            <w:pPr>
+              <w:jc w:val="center"/>
+              <w:rPr>
+                <w:rFonts w:ascii="Times New Roman" w:hAnsi="Times New Roman" w:cs="Times New Roman"/>
+                <w:lang w:val="tr-TR"/>
+              </w:rPr>
+            </w:pPr>
+            <w:r>
+              <w:rPr>
+                <w:rFonts w:ascii="Times New Roman" w:hAnsi="Times New Roman" w:cs="Times New Roman"/>
+                <w:lang w:val="tr-TR"/>
+              </w:rPr>
+              <w:t xml:space="preserve">Daniell (çinko-bakır) pilinin çalışması</w:t>
+            </w:r>
+          </w:p>
+        </w:tc>
+        <w:tc>
+          <w:tcPr>
+            <w:tcW w:w="3000" w:type="dxa"/>
+            <w:vAlign w:val="center"/>
+          </w:tcPr>
+          <w:p>
+            <w:pPr>
+              <w:jc w:val="center"/>
+              <w:rPr>
+                <w:rFonts w:ascii="Times New Roman" w:hAnsi="Times New Roman" w:cs="Times New Roman"/>
+                <w:lang w:val="tr-TR"/>
+              </w:rPr>
+            </w:pPr>
+            <w:r>
+              <w:rPr>
+                <w:rFonts w:ascii="Times New Roman" w:hAnsi="Times New Roman" w:cs="Times New Roman"/>
+                <w:lang w:val="tr-TR"/>
+              </w:rPr>
+              <w:t xml:space="preserve">2</w:t>
+            </w:r>
+          </w:p>
+          <w:p>
+            <w:pPr>
+              <w:jc w:val="center"/>
+              <w:rPr>
+                <w:rFonts w:ascii="Times New Roman" w:hAnsi="Times New Roman" w:cs="Times New Roman"/>
+                <w:lang w:val="tr-TR"/>
+              </w:rPr>
+            </w:pPr>
+            <w:r>
+              <w:rPr>
+                <w:rFonts w:ascii="Times New Roman" w:hAnsi="Times New Roman" w:cs="Times New Roman"/>
+                <w:lang w:val="tr-TR"/>
+              </w:rPr>
+              <w:t xml:space="preserve">Ergimiş NaCl’nin elektrolizi</w:t>
+            </w:r>
+          </w:p>
+        </w:tc>
+        <w:tc>
+          <w:tcPr>
+            <w:tcW w:w="3000" w:type="dxa"/>
+            <w:vAlign w:val="center"/>
+          </w:tcPr>
+          <w:p>
+            <w:pPr>
+              <w:jc w:val="center"/>
+              <w:rPr>
+                <w:rFonts w:ascii="Times New Roman" w:hAnsi="Times New Roman" w:cs="Times New Roman"/>
+                <w:lang w:val="tr-TR"/>
+              </w:rPr>
+            </w:pPr>
+            <w:r>
+              <w:rPr>
+                <w:rFonts w:ascii="Times New Roman" w:hAnsi="Times New Roman" w:cs="Times New Roman"/>
+                <w:lang w:val="tr-TR"/>
+              </w:rPr>
+              <w:t xml:space="preserve">3</w:t>
+            </w:r>
+          </w:p>
+          <w:p>
+            <w:pPr>
+              <w:jc w:val="center"/>
+              <w:rPr>
+                <w:rFonts w:ascii="Times New Roman" w:hAnsi="Times New Roman" w:cs="Times New Roman"/>
+                <w:lang w:val="tr-TR"/>
+              </w:rPr>
+            </w:pPr>
+            <w:r>
+              <w:rPr>
+                <w:rFonts w:ascii="Times New Roman" w:hAnsi="Times New Roman" w:cs="Times New Roman"/>
+                <w:lang w:val="tr-TR"/>
+              </w:rPr>
+              <w:t xml:space="preserve">Telefon bataryasının şarj edilmesi</w:t>
+            </w:r>
+          </w:p>
+        </w:tc>
+      </w:tr>
+      <w:tr>
+        <w:trPr>
+          <w:trHeight w:val="900"/>
+        </w:trPr>
+        <w:tc>
+          <w:tcPr>
+            <w:tcW w:w="3000" w:type="dxa"/>
+            <w:vAlign w:val="center"/>
+          </w:tcPr>
+          <w:p>
+            <w:pPr>
+              <w:jc w:val="center"/>
+              <w:rPr>
+                <w:rFonts w:ascii="Times New Roman" w:hAnsi="Times New Roman" w:cs="Times New Roman"/>
+                <w:lang w:val="tr-TR"/>
+              </w:rPr>
+            </w:pPr>
+            <w:r>
+              <w:rPr>
+                <w:rFonts w:ascii="Times New Roman" w:hAnsi="Times New Roman" w:cs="Times New Roman"/>
+                <w:lang w:val="tr-TR"/>
+              </w:rPr>
+              <w:t xml:space="preserve">4</w:t>
+            </w:r>
+          </w:p>
+          <w:p>
+            <w:pPr>
+              <w:jc w:val="center"/>
+              <w:rPr>
+                <w:rFonts w:ascii="Times New Roman" w:hAnsi="Times New Roman" w:cs="Times New Roman"/>
+                <w:lang w:val="tr-TR"/>
+              </w:rPr>
+            </w:pPr>
+            <w:r>
+              <w:rPr>
+                <w:rFonts w:ascii="Times New Roman" w:hAnsi="Times New Roman" w:cs="Times New Roman"/>
+                <w:lang w:val="tr-TR"/>
+              </w:rPr>
+              <w:t xml:space="preserve">Bakır bileziğin altınla kaplanması</w:t>
+            </w:r>
+          </w:p>
+        </w:tc>
+        <w:tc>
+          <w:tcPr>
+            <w:tcW w:w="3000" w:type="dxa"/>
+            <w:vAlign w:val="center"/>
+          </w:tcPr>
+          <w:p>
+            <w:pPr>
+              <w:jc w:val="center"/>
+              <w:rPr>
+                <w:rFonts w:ascii="Times New Roman" w:hAnsi="Times New Roman" w:cs="Times New Roman"/>
+                <w:lang w:val="tr-TR"/>
+              </w:rPr>
+            </w:pPr>
+            <w:r>
+              <w:rPr>
+                <w:rFonts w:ascii="Times New Roman" w:hAnsi="Times New Roman" w:cs="Times New Roman"/>
+                <w:lang w:val="tr-TR"/>
+              </w:rPr>
+              <w:t xml:space="preserve">5</w:t>
+            </w:r>
+          </w:p>
+          <w:p>
+            <w:pPr>
+              <w:jc w:val="center"/>
+              <w:rPr>
+                <w:rFonts w:ascii="Times New Roman" w:hAnsi="Times New Roman" w:cs="Times New Roman"/>
+                <w:lang w:val="tr-TR"/>
+              </w:rPr>
+            </w:pPr>
+            <w:r>
+              <w:rPr>
+                <w:rFonts w:ascii="Times New Roman" w:hAnsi="Times New Roman" w:cs="Times New Roman"/>
+                <w:lang w:val="tr-TR"/>
+              </w:rPr>
+              <w:t xml:space="preserve">Demir çivinin nemli havada paslanması</w:t>
+            </w:r>
+          </w:p>
+        </w:tc>
+        <w:tc>
+          <w:tcPr>
+            <w:tcW w:w="3000" w:type="dxa"/>
+            <w:vAlign w:val="center"/>
+          </w:tcPr>
+          <w:p>
+            <w:pPr>
+              <w:jc w:val="center"/>
+              <w:rPr>
+                <w:rFonts w:ascii="Times New Roman" w:hAnsi="Times New Roman" w:cs="Times New Roman"/>
+                <w:lang w:val="tr-TR"/>
+              </w:rPr>
+            </w:pPr>
+            <w:r>
+              <w:rPr>
+                <w:rFonts w:ascii="Times New Roman" w:hAnsi="Times New Roman" w:cs="Times New Roman"/>
+                <w:lang w:val="tr-TR"/>
+              </w:rPr>
+              <w:t xml:space="preserve">6</w:t>
+            </w:r>
+          </w:p>
+          <w:p>
+            <w:pPr>
+              <w:jc w:val="center"/>
+              <w:rPr>
+                <w:rFonts w:ascii="Times New Roman" w:hAnsi="Times New Roman" w:cs="Times New Roman"/>
+                <w:lang w:val="tr-TR"/>
+              </w:rPr>
+            </w:pPr>
+            <w:r>
+              <w:rPr>
+                <w:rFonts w:ascii="Times New Roman" w:hAnsi="Times New Roman" w:cs="Times New Roman"/>
+                <w:lang w:val="tr-TR"/>
+              </w:rPr>
+              <w:t xml:space="preserve">Yer altındaki çelik borunun magnezyum kurban anotla korunması</w:t>
+            </w:r>
+          </w:p>
+        </w:tc>
+      </w:tr>
+      <w:tr>
+        <w:trPr>
+          <w:trHeight w:val="900"/>
+        </w:trPr>
+        <w:tc>
+          <w:tcPr>
+            <w:tcW w:w="3000" w:type="dxa"/>
+            <w:vAlign w:val="center"/>
+          </w:tcPr>
+          <w:p>
+            <w:pPr>
+              <w:jc w:val="center"/>
+              <w:rPr>
+                <w:rFonts w:ascii="Times New Roman" w:hAnsi="Times New Roman" w:cs="Times New Roman"/>
+                <w:lang w:val="tr-TR"/>
+              </w:rPr>
+            </w:pPr>
+            <w:r>
+              <w:rPr>
+                <w:rFonts w:ascii="Times New Roman" w:hAnsi="Times New Roman" w:cs="Times New Roman"/>
+                <w:lang w:val="tr-TR"/>
+              </w:rPr>
+              <w:t xml:space="preserve">7</w:t>
+            </w:r>
+          </w:p>
+          <w:p>
+            <w:pPr>
+              <w:jc w:val="center"/>
+              <w:rPr>
+                <w:rFonts w:ascii="Times New Roman" w:hAnsi="Times New Roman" w:cs="Times New Roman"/>
+                <w:lang w:val="tr-TR"/>
+              </w:rPr>
+            </w:pPr>
+            <w:r>
+              <w:rPr>
+                <w:rFonts w:ascii="Times New Roman" w:hAnsi="Times New Roman" w:cs="Times New Roman"/>
+                <w:lang w:val="tr-TR"/>
+              </w:rPr>
+              <w:t xml:space="preserve">El fenerindeki pilin çalışması</w:t>
+            </w:r>
+          </w:p>
+        </w:tc>
+        <w:tc>
+          <w:tcPr>
+            <w:tcW w:w="3000" w:type="dxa"/>
+            <w:vAlign w:val="center"/>
+          </w:tcPr>
+          <w:p>
+            <w:pPr>
+              <w:jc w:val="center"/>
+              <w:rPr>
+                <w:rFonts w:ascii="Times New Roman" w:hAnsi="Times New Roman" w:cs="Times New Roman"/>
+                <w:lang w:val="tr-TR"/>
+              </w:rPr>
+            </w:pPr>
+            <w:r>
+              <w:rPr>
+                <w:rFonts w:ascii="Times New Roman" w:hAnsi="Times New Roman" w:cs="Times New Roman"/>
+                <w:lang w:val="tr-TR"/>
+              </w:rPr>
+              <w:t xml:space="preserve">8</w:t>
+            </w:r>
+          </w:p>
+          <w:p>
+            <w:pPr>
+              <w:jc w:val="center"/>
+              <w:rPr>
+                <w:rFonts w:ascii="Times New Roman" w:hAnsi="Times New Roman" w:cs="Times New Roman"/>
+                <w:lang w:val="tr-TR"/>
+              </w:rPr>
+            </w:pPr>
+            <w:r>
+              <w:rPr>
+                <w:rFonts w:ascii="Times New Roman" w:hAnsi="Times New Roman" w:cs="Times New Roman"/>
+                <w:lang w:val="tr-TR"/>
+              </w:rPr>
+              <w:t xml:space="preserve">Suyun elektrolizi</w:t>
+            </w:r>
+          </w:p>
+        </w:tc>
+        <w:tc>
+          <w:tcPr>
+            <w:tcW w:w="3000" w:type="dxa"/>
+            <w:vAlign w:val="center"/>
+          </w:tcPr>
+          <w:p>
+            <w:pPr>
+              <w:jc w:val="center"/>
+              <w:rPr>
+                <w:rFonts w:ascii="Times New Roman" w:hAnsi="Times New Roman" w:cs="Times New Roman"/>
+                <w:lang w:val="tr-TR"/>
+              </w:rPr>
+            </w:pPr>
+            <w:r>
+              <w:rPr>
+                <w:rFonts w:ascii="Times New Roman" w:hAnsi="Times New Roman" w:cs="Times New Roman"/>
+                <w:lang w:val="tr-TR"/>
+              </w:rPr>
+              <w:t xml:space="preserve">9</w:t>
+            </w:r>
+          </w:p>
+          <w:p>
+            <w:pPr>
+              <w:jc w:val="center"/>
+              <w:rPr>
+                <w:rFonts w:ascii="Times New Roman" w:hAnsi="Times New Roman" w:cs="Times New Roman"/>
+                <w:lang w:val="tr-TR"/>
+              </w:rPr>
+            </w:pPr>
+            <w:r>
+              <w:rPr>
+                <w:rFonts w:ascii="Times New Roman" w:hAnsi="Times New Roman" w:cs="Times New Roman"/>
+                <w:lang w:val="tr-TR"/>
+              </w:rPr>
+              <w:t xml:space="preserve">Çeliğin erimiş çinkoya daldırılarak kaplanması</w:t>
+            </w:r>
+          </w:p>
+        </w:tc>
+      </w:tr>
+    </w:tbl>
+    <w:p>
+      <w:pPr>
+        <w:jc w:val="both"/>
+        <w:rPr>
+          <w:rFonts w:ascii="Times New Roman" w:hAnsi="Times New Roman" w:cs="Times New Roman"/>
+          <w:lang w:val="tr-TR"/>
+        </w:rPr>
+      </w:pPr>
+      <w:r>
+        <w:rPr>
+          <w:rFonts w:ascii="Times New Roman" w:hAnsi="Times New Roman" w:cs="Times New Roman"/>
+          <w:lang w:val="tr-TR"/>
+        </w:rPr>
+        <w:t xml:space="preserve">a) Kimyasal enerjinin elektrik enerjisine dönüştüğü süreçler hangileridir?</w:t>
+      </w:r>
+    </w:p>
+    <w:p>
+      <w:pPr>
+        <w:jc w:val="center"/>
+        <w:rPr>
+          <w:rFonts w:ascii="Times New Roman" w:hAnsi="Times New Roman" w:cs="Times New Roman"/>
+          <w:lang w:val="tr-TR"/>
+        </w:rPr>
+      </w:pPr>
+      <w:r>
+        <w:rPr>
+          <w:rFonts w:ascii="Times New Roman" w:hAnsi="Times New Roman" w:cs="Times New Roman"/>
+          <w:lang w:val="tr-TR"/>
+        </w:rPr>
+        <w:t xml:space="preserve">……………………………………………………………………………………………</w:t>
+      </w:r>
+    </w:p>
+    <w:p>
+      <w:pPr>
+        <w:jc w:val="both"/>
+        <w:rPr>
+          <w:rFonts w:ascii="Times New Roman" w:hAnsi="Times New Roman" w:cs="Times New Roman"/>
+          <w:lang w:val="tr-TR"/>
+        </w:rPr>
+      </w:pPr>
+      <w:r>
+        <w:rPr>
+          <w:rFonts w:ascii="Times New Roman" w:hAnsi="Times New Roman" w:cs="Times New Roman"/>
+          <w:lang w:val="tr-TR"/>
+        </w:rPr>
+        <w:t xml:space="preserve">b) Elektrik enerjisi kullanılarak istemsiz bir tepkimenin gerçekleştirildiği süreçler hangileridir?</w:t>
+      </w:r>
+    </w:p>
+    <w:p>
+      <w:pPr>
+        <w:jc w:val="center"/>
+        <w:rPr>
+          <w:rFonts w:ascii="Times New Roman" w:hAnsi="Times New Roman" w:cs="Times New Roman"/>
+          <w:lang w:val="tr-TR"/>
+        </w:rPr>
+      </w:pPr>
+      <w:r>
+        <w:rPr>
+          <w:rFonts w:ascii="Times New Roman" w:hAnsi="Times New Roman" w:cs="Times New Roman"/>
+          <w:lang w:val="tr-TR"/>
+        </w:rPr>
+        <w:t xml:space="preserve">……………………………………………………………………………………………</w:t>
+      </w:r>
+    </w:p>
+    <w:p>
+      <w:pPr>
+        <w:jc w:val="both"/>
+        <w:rPr>
+          <w:rFonts w:ascii="Times New Roman" w:hAnsi="Times New Roman" w:cs="Times New Roman"/>
+          <w:lang w:val="tr-TR"/>
+        </w:rPr>
+      </w:pPr>
+      <w:r>
+        <w:rPr>
+          <w:rFonts w:ascii="Times New Roman" w:hAnsi="Times New Roman" w:cs="Times New Roman"/>
+          <w:lang w:val="tr-TR"/>
+        </w:rPr>
+        <w:t xml:space="preserve">c) Demirin korozyonunu önlemek için kullanılan yöntemler hangileridir?</w:t>
+      </w:r>
+    </w:p>
+    <w:p>
+      <w:pPr>
+        <w:jc w:val="center"/>
+        <w:rPr>
+          <w:rFonts w:ascii="Times New Roman" w:hAnsi="Times New Roman" w:cs="Times New Roman"/>
+          <w:lang w:val="tr-TR"/>
+        </w:rPr>
+      </w:pPr>
+      <w:r>
+        <w:rPr>
+          <w:rFonts w:ascii="Times New Roman" w:hAnsi="Times New Roman" w:cs="Times New Roman"/>
+          <w:lang w:val="tr-TR"/>
+        </w:rPr>
+        <w:t xml:space="preserve">……………………………………………………………………………………………</w:t>
+      </w:r>
+    </w:p>
+    <w:p>
+      <w:pPr>
+        <w:jc w:val="both"/>
+        <w:rPr>
+          <w:rFonts w:ascii="Times New Roman" w:hAnsi="Times New Roman" w:cs="Times New Roman"/>
+          <w:lang w:val="tr-TR"/>
+        </w:rPr>
+      </w:pPr>
+      <w:r>
+        <w:rPr>
+          <w:rFonts w:ascii="Times New Roman" w:hAnsi="Times New Roman" w:cs="Times New Roman"/>
+          <w:lang w:val="tr-TR"/>
+        </w:rPr>
+        <w:t xml:space="preserve">ç) Demirin yükseltgendiği süreç hangisidir?</w:t>
+      </w:r>
+    </w:p>
+    <w:p>
+      <w:pPr>
+        <w:jc w:val="center"/>
+        <w:rPr>
+          <w:rFonts w:ascii="Times New Roman" w:hAnsi="Times New Roman" w:cs="Times New Roman"/>
+          <w:lang w:val="tr-TR"/>
+        </w:rPr>
+      </w:pPr>
+      <w:r>
+        <w:rPr>
+          <w:rFonts w:ascii="Times New Roman" w:hAnsi="Times New Roman" w:cs="Times New Roman"/>
+          <w:lang w:val="tr-TR"/>
+        </w:rPr>
+        <w:t xml:space="preserve">……………………………………………………………………………………………</w:t>
+      </w:r>
+    </w:p>
+    <w:p>
+      <w:pPr>
+        <w:ind w:left="720"/>
+        <w:jc w:val="both"/>
+        <w:rPr>
+          <w:rFonts w:ascii="Times New Roman" w:hAnsi="Times New Roman" w:cs="Times New Roman"/>
+          <w:lang w:val="tr-TR"/>
+        </w:rPr>
+      </w:pPr>
+      <w:r>
+        <w:rPr>
+          <w:rFonts w:ascii="Times New Roman" w:hAnsi="Times New Roman" w:cs="Times New Roman"/>
+          <w:color w:val="FF0000"/>
+          <w:lang w:val="tr-TR"/>
+        </w:rPr>
+        <w:t xml:space="preserve">Cevap: a) 1, 7  b) 2, 3, 4, 8  c) 6, 9  ç) 5</w:t>
       </w:r>
     </w:p>
     <w:p>

</xml_diff>

<commit_message>
Soru dosyalarindaki 'veriler ogretim amacli olarak duzenlenmistir' notlari silindi
</commit_message>
<xml_diff>
--- a/dijital/Kim12_tema-1-dijital-unite-sonu-sorulari.docx
+++ b/dijital/Kim12_tema-1-dijital-unite-sonu-sorulari.docx
@@ -1404,33 +1404,6 @@
           <w:lang w:val="tr-TR"/>
         </w:rPr>
       </w:pPr>
-    </w:p>
-    <w:p>
-      <w:pPr>
-        <w:jc w:val="both"/>
-        <w:rPr>
-          <w:rFonts w:ascii="Times New Roman" w:hAnsi="Times New Roman" w:cs="Times New Roman"/>
-          <w:lang w:val="tr-TR"/>
-        </w:rPr>
-      </w:pPr>
-      <w:r>
-        <w:rPr>
-          <w:rFonts w:ascii="Times New Roman" w:hAnsi="Times New Roman" w:cs="Times New Roman"/>
-          <w:b/>
-          <w:bCs/>
-          <w:highlight w:val="yellow"/>
-          <w:lang w:val="tr-TR"/>
-        </w:rPr>
-        <w:t xml:space="preserve">NOT: </w:t>
-      </w:r>
-      <w:r>
-        <w:rPr>
-          <w:rFonts w:ascii="Times New Roman" w:hAnsi="Times New Roman" w:cs="Times New Roman"/>
-          <w:highlight w:val="yellow"/>
-          <w:lang w:val="tr-TR"/>
-        </w:rPr>
-        <w:t xml:space="preserve">Tablodaki veriler öğretim amaçlı olarak düzenlenmiştir.</w:t>
-      </w:r>
     </w:p>
     <w:p>
       <w:pPr>

</xml_diff>